<commit_message>
fix: improve offer number/version label visibility on offers list
Offer number (offer_id / offer_id.N) was barely readable (dim, tiny
mono font) and buried below the offer title, per tester feedback.
Now it's the primary row headline, with the offer's own name shown
underneath as secondary. Bumped size/contrast on the "previous
version(s)" toggle too. Updates v1.6 report accordingly.

Co-Authored-By: Claude Sonnet 5 <noreply@anthropic.com>
</commit_message>
<xml_diff>
--- a/Historia wersji oraz md/Historia wersji/AMSteel_Quote_Raport_Wersji_1.6.docx
+++ b/Historia wersji oraz md/Historia wersji/AMSteel_Quote_Raport_Wersji_1.6.docx
@@ -282,7 +282,7 @@
           </w:tcPr>
           <w:p>
             <w:r>
-              <w:t>Uzupełniono tabelę gatunków PICKLED (HRS Trawiona) o brakujący zakres SAPH 440 -&gt; DD12 wraz z dodatkowymi gatunkami (K367-DD14+B, FE 600 DP, S300EK, P265GH, P275SL, P355NL2, SA516G60-LOWSI, S240 D), na podstawie danych przekazanych przez klienta.</w:t>
+              <w:t>Uzupełniono tabelę gatunków PICKLED (HRS Trawiona) o brakujący zakres SAPH 440 -&gt; DD12 wraz z dodatkowymi gatunkami (K367-DD14+B, FE 600 DP, S300EK, P265GH, P275SL, P355NL2, SA516G60-LOWSI, S240 D), na podstawie danych przekazanych przez klienta. Poprawiono czytelność etykiet wersjonowania na liście ofert (numer oferty offer_id/offer_id.N zamieniony miejscami z nazwą oferty jako główny nagłówek wiersza, wyraźniejsza etykieta „poprzednia wersja”).</w:t>
             </w:r>
           </w:p>
         </w:tc>
@@ -860,7 +860,7 @@
           </w:tcPr>
           <w:p>
             <w:r>
-              <w:t>—</w:t>
+              <w:t>Zmiana</w:t>
             </w:r>
           </w:p>
         </w:tc>
@@ -870,7 +870,7 @@
           </w:tcPr>
           <w:p>
             <w:r>
-              <w:t>Brak zmian</w:t>
+              <w:t>Na liście „Moje oferty” poprawiono czytelność etykiet wersjonowania, zgłoszoną przez testerów jako ledwo widoczną: numer oferty (offer_id / offer_id.N) zamieniono miejscami z nazwą własną oferty - numer jest teraz głównym, pogrubionym nagłówkiem wiersza, a nazwa własna (jeśli nadana) widnieje pod nim jako drugorzędna. Etykieta „poprzednia wersja / poprzednie wersje” przy rozwijanej historii wersji oferty otrzymała większą czcionkę i wyższy kontrast koloru, czytelny we wszystkich motywach (jasny / ciemny / wysoki kontrast).</w:t>
             </w:r>
           </w:p>
         </w:tc>

</xml_diff>

<commit_message>
feat: bring local dev startup script into the repo, make it one-shot
Move steelquote-start.ps1/steelquote-stop.ps1 from the user's home
directory into the repo so version control covers them. Harden the
Postgres readiness check to use pg_isready instead of pg_ctl status,
which could misreport "no server running" after an unclean shutdown
and leave Postgres never started - the root cause of the login server
error on localhost:3000. The script now also auto-opens the browser
once next dev is up, so running it is the only step needed.

Log the change in the v1.6 report and correct the now-stale script
path/migration-range notes it referenced.

Co-Authored-By: Claude Sonnet 5 <noreply@anthropic.com>
</commit_message>
<xml_diff>
--- a/Historia wersji oraz md/Historia wersji/AMSteel_Quote_Raport_Wersji_1.6.docx
+++ b/Historia wersji oraz md/Historia wersji/AMSteel_Quote_Raport_Wersji_1.6.docx
@@ -282,7 +282,7 @@
           </w:tcPr>
           <w:p>
             <w:r>
-              <w:t>Uzupełniono tabelę gatunków PICKLED (HRS Trawiona) o brakujący zakres SAPH 440 -&gt; DD12 wraz z dodatkowymi gatunkami (K367-DD14+B, FE 600 DP, S300EK, P265GH, P275SL, P355NL2, SA516G60-LOWSI, S240 D), na podstawie danych przekazanych przez klienta. Poprawiono czytelność etykiet wersjonowania na liście ofert (numer oferty offer_id/offer_id.N zamieniony miejscami z nazwą oferty jako główny nagłówek wiersza, wyraźniejsza etykieta „poprzednia wersja”).</w:t>
+              <w:t>Uzupełniono tabelę gatunków PICKLED (HRS Trawiona) o brakujący zakres SAPH 440 -&gt; DD12 wraz z dodatkowymi gatunkami (K367-DD14+B, FE 600 DP, S300EK, P265GH, P275SL, P355NL2, SA516G60-LOWSI, S240 D), na podstawie danych przekazanych przez klienta. Poprawiono czytelność etykiet wersjonowania na liście ofert (numer oferty offer_id/offer_id.N zamieniony miejscami z nazwą oferty jako główny nagłówek wiersza, wyraźniejsza etykieta „poprzednia wersja”). Przycisk „Aktualizuj pozycję” w kalkulatorze zmienia teraz kolor na niebieski podczas edycji istniejącej pozycji, aby odróżnić go od żółtego przycisku dodawania nowej pozycji.</w:t>
             </w:r>
           </w:p>
         </w:tc>
@@ -325,8 +325,6 @@
           <w:p>
             <w:r>
               <w:t xml:space="preserve">Naprawiono brak synchronizacji kontaktu głównego wpisywanego w panelu „Klienci” z tabelą osób kontaktowych - dane osoby zapisane przy edycji firmy nie pojawiały się w zakładce „Kontakty”. Panel „Klienci” zyskał akcję „Kontakty” przy każdej firmie: rozwija listę zapisanych dla niej osób z możliwością edycji i usunięcia każdej z osobna oraz formularzem dodania kolejnej, bez przechodzenia do osobnej zakładki. Dodano migrację uzupełniającą kontakty zapisane, zanim ta poprawka weszła w życie. Dodano tryb „Wysoki kontrast” (przycisk obok Jasny/Ciemny, dostępny na wszystkich podstronach). W tym samym okresie dodano historię zmian cen bazowych PGL z eksportem do Excela, kolorowe oznaczenia typów stali HRS/CR/HDG w panelu ustawień oraz klikalne kafelki statusów na pulpicie administratora, a w kalkulatorze </w:t>
-            </w:r>
-            <w:r>
               <w:lastRenderedPageBreak/>
               <w:t>kliknięcie wiersza pozycji otwiera ją do edycji. Kolumna „Uwagi” w PDF oferty pokazuje teraz pełny zestaw wybranych dopłat dla każdej pozycji. Panel ustawień administratora zyskał próg „Minimalna marża (%)” - junior może odtąd wysłać ofertę do klienta bezpośrednio z szkicu, bez zatwierdzenia seniora/administratora, jeśli każda pozycja ma marżę i PGL bazowe w normie; w przeciwnym razie oferta nadal wymaga pełnej ścieżki zatwierdzenia. Kliknięcie w ofertę na liście (Moje oferty, Panel seniora, Panel administratora) otwiera ją teraz do edycji, tak jak pozycje w kalkulatorze. Edycja już zapisanej oferty nie nadpisuje jej w miejscu - zapisuje nową wersję („offer_30.1”, „offer_30.2”...), a poprzednie wersje zostają widoczne pod rozwijaną listą na tej samej karcie. W tym samym okresie dodano trzy nowe typy stali obok HRS/CR/HDG: PICKLED (HRS Trawiona), TEARDROP (Blacha łezkowa) i ZM (Magnelis) - wraz z własnymi tabelami gatunków, matrycami dopłat wymiarowych i (dla ZM) matrycą powłoki, w oparciu o dane przekazane przez klienta.</w:t>
             </w:r>
@@ -372,8 +370,6 @@
           <w:p>
             <w:r>
               <w:t xml:space="preserve">Poprawki bezpieczeństwa eksportu PDF: dane oferty i klienta wpisywane przez handlowca są zabezpieczane przed wykonaniem jako kod po stronie usługi generującej dokument, a samo generowanie PDF wymaga jawnie potwierdzonej roli użytkownika. W kalkulatorze dodano ostrzeżenie przy edycji pozycji dodanych przed wersją 1.3, dla których konfiguracja dopłat nie została zapisana i nie da się jej automatycznie odtworzyć. Przebudowano panel danych klienta w kalkulatorze: dane firmy (firma, NIP, adres, SAP ID) zostały oddzielone od danych kontaktowych, </w:t>
-            </w:r>
-            <w:r>
               <w:lastRenderedPageBreak/>
               <w:t>a pola „Firma” i „NIP” działają jak wyszukiwarki po katalogu klientów. Osoby kontaktowe są od teraz wspólne dla całego działu - jedna firma może mieć ich wiele, a pole imienia podpowiada je od razu po kliknięciu. Naprawiono także brak natychmiastowej widoczności zmian ustawień administratora (PGL bazowe, kurs EUR/PLN) w kalkulatorze bez przeładowania strony, a PGL bazowe skonfigurowano osobno dla typów stali HRS, CR i HDG. Cena końcowa oraz sumy wartości w kalkulatorze, na liście ofert i w PDF są od teraz zaokrąglane w górę do pełnej jednostki waluty - świadoma decyzja biznesowa, żeby nigdy nie zaniżyć ceny wobec klienta.</w:t>
             </w:r>
@@ -472,8 +468,6 @@
           <w:p>
             <w:r>
               <w:t xml:space="preserve">Poprawki regresji po integracji podczas Deployu (m.in. krytyczny błąd edycji pozycji, przywrócona waga arkusza), ujednolicenie generowania PDF na wersję serwerową, zamknięcie rejestracji </w:t>
-            </w:r>
-            <w:r>
               <w:lastRenderedPageBreak/>
               <w:t>kont dla administratora oraz eksport ofert do Excela w formacie KTS/GPAO.</w:t>
             </w:r>
@@ -678,7 +672,7 @@
           </w:tcPr>
           <w:p>
             <w:r>
-              <w:t>—</w:t>
+              <w:t>Zmiana</w:t>
             </w:r>
           </w:p>
         </w:tc>
@@ -688,7 +682,7 @@
           </w:tcPr>
           <w:p>
             <w:r>
-              <w:t>Brak zmian</w:t>
+              <w:t xml:space="preserve">Lokalny skrypt startowy środowiska deweloperskiego (steelquote-start.ps1) przeniesiony z prywatnego katalogu użytkownika do repozytorium i wzmocniony: sprawdzanie stanu Postgresa oparto o pg_isready zamiast pg_ctl status, który po nieczystym zamknięciu potrafił mylnie zgłaszać „brak uruchomionego serwera” - w efekcie baza nie startowała, co dawało błąd serwera przy próbie logowania na localhost:3000. Skrypt w jednym uruchomieniu startuje teraz Postgres, tworzy bazę, wgrywa wszystkie migracje, instaluje zależności (jeśli trzeba), seeduje konta testowe, startuje next dev i sam otwiera przeglądarkę - bez żadnych ręcznych kroków. Dodano też towarzyszący skrypt zatrzymujący (steelquote-stop.ps1).</w:t>
             </w:r>
           </w:p>
         </w:tc>
@@ -1042,7 +1036,7 @@
           </w:tcPr>
           <w:p>
             <w:r>
-              <w:t>—</w:t>
+              <w:t>Zmiana</w:t>
             </w:r>
           </w:p>
         </w:tc>
@@ -1052,7 +1046,7 @@
           </w:tcPr>
           <w:p>
             <w:r>
-              <w:t>Brak zmian</w:t>
+              <w:t>Przy edycji istniejącej pozycji w kalkulatorze przycisk „Aktualizuj pozycję” zmienia teraz kolor na niebieski, odróżniając się od żółtego przycisku „Dodaj do listy” używanego przy dodawaniu nowej pozycji - zapobiega przypadkowemu pomyleniu trybu edycji z dodawaniem nowej pozycji.</w:t>
             </w:r>
           </w:p>
         </w:tc>

</xml_diff>

<commit_message>
feat: auto-scroll calculator to top when editing a zestawienie item
Clicking a row or the pencil icon on the summary list now scrolls the
page up to the calculator inputs, so the loaded item is visible
without manual scrolling on longer lists.

docs: update v1.6 report with scroll-to-top fix and PGL-in-EUR note
</commit_message>
<xml_diff>
--- a/Historia wersji oraz md/Historia wersji/AMSteel_Quote_Raport_Wersji_1.6.docx
+++ b/Historia wersji oraz md/Historia wersji/AMSteel_Quote_Raport_Wersji_1.6.docx
@@ -282,7 +282,7 @@
           </w:tcPr>
           <w:p>
             <w:r>
-              <w:t>Uzupełniono tabelę gatunków PICKLED (HRS Trawiona) o brakujący zakres SAPH 440 -&gt; DD12 wraz z dodatkowymi gatunkami (K367-DD14+B, FE 600 DP, S300EK, P265GH, P275SL, P355NL2, SA516G60-LOWSI, S240 D), na podstawie danych przekazanych przez klienta. Poprawiono czytelność etykiet wersjonowania na liście ofert (numer oferty offer_id/offer_id.N zamieniony miejscami z nazwą oferty jako główny nagłówek wiersza, wyraźniejsza etykieta „poprzednia wersja”). Przycisk „Aktualizuj pozycję” w kalkulatorze zmienia teraz kolor na niebieski podczas edycji istniejącej pozycji, aby odróżnić go od żółtego przycisku dodawania nowej pozycji.</w:t>
+              <w:t>Uzupełniono tabelę gatunków PICKLED (HRS Trawiona) o brakujący zakres SAPH 440 -&gt; DD12 wraz z dodatkowymi gatunkami (K367-DD14+B, FE 600 DP, S300EK, P265GH, P275SL, P355NL2, SA516G60-LOWSI, S240 D), na podstawie danych przekazanych przez klienta. Poprawiono czytelność etykiet wersjonowania na liście ofert (numer oferty offer_id/offer_id.N zamieniony miejscami z nazwą oferty jako główny nagłówek wiersza, wyraźniejsza etykieta „poprzednia wersja”). Przycisk „Aktualizuj pozycję” w kalkulatorze zmienia teraz kolor na niebieski podczas edycji istniejącej pozycji, aby odróżnić go od żółtego przycisku dodawania nowej pozycji. Kliknięcie pozycji na liście zestawienia (wiersz lub ołówek) przewija teraz widok automatycznie do góry kalkulatora. Cena bazowa PGL jest od teraz zawsze w EUR (€/t), niezależnie od waluty oferty.</w:t>
             </w:r>
           </w:p>
         </w:tc>
@@ -778,6 +778,50 @@
           </w:p>
         </w:tc>
       </w:tr>
+      <w:tr>
+        <w:tc>
+          <w:tcPr>
+            <w:tcW w:w="1948" w:type="dxa"/>
+          </w:tcPr>
+          <w:p>
+            <w:r>
+              <w:t>Zmiana</w:t>
+            </w:r>
+          </w:p>
+        </w:tc>
+        <w:tc>
+          <w:tcPr>
+            <w:tcW w:w="6908" w:type="dxa"/>
+          </w:tcPr>
+          <w:p>
+            <w:r>
+              <w:t>Kliknięcie w pozycję na liście zestawienia (wiersz lub ikona ołówka) automatycznie przewija widok do góry kalkulatora - przy dłuższych listach (więcej niż ok. 3 pozycje) użytkownik nie musiał wcześniej ręcznie przewijać ekranu, żeby zobaczyć wczytane dane do edycji.</w:t>
+            </w:r>
+          </w:p>
+        </w:tc>
+      </w:tr>
+      <w:tr>
+        <w:tc>
+          <w:tcPr>
+            <w:tcW w:w="1948" w:type="dxa"/>
+          </w:tcPr>
+          <w:p>
+            <w:r>
+              <w:t>Zmiana</w:t>
+            </w:r>
+          </w:p>
+        </w:tc>
+        <w:tc>
+          <w:tcPr>
+            <w:tcW w:w="6908" w:type="dxa"/>
+          </w:tcPr>
+          <w:p>
+            <w:r>
+              <w:t>Cena bazowa PGL jest teraz zawsze wprowadzana i wyświetlana w EUR (€/t), niezależnie od wybranej waluty oferty (EUR/PLN) - zgodnie z decyzją handlową, że cena wsadu jest notowaniem międzynarodowym. Wcześniej pole podążało za przełącznikiem waluty, co mogło wprowadzać w błąd przy ofertach w PLN.</w:t>
+            </w:r>
+          </w:p>
+        </w:tc>
+      </w:tr>
     </w:tbl>
     <w:p>
       <w:pPr>

</xml_diff>

<commit_message>
docs: log offer-edit banner + version-label fix in v1.6 report
Adds the "currently editing offer" banner and the offer_id-vs-version-label
fix to the v1.6 changelog (running summary + Zarzadzanie ofertami table).
</commit_message>
<xml_diff>
--- a/Historia wersji oraz md/Historia wersji/AMSteel_Quote_Raport_Wersji_1.6.docx
+++ b/Historia wersji oraz md/Historia wersji/AMSteel_Quote_Raport_Wersji_1.6.docx
@@ -282,7 +282,7 @@
           </w:tcPr>
           <w:p>
             <w:r>
-              <w:t>Uzupełniono tabelę gatunków PICKLED (HRS Trawiona) o brakujący zakres SAPH 440 -&gt; DD12 wraz z dodatkowymi gatunkami (K367-DD14+B, FE 600 DP, S300EK, P265GH, P275SL, P355NL2, SA516G60-LOWSI, S240 D), na podstawie danych przekazanych przez klienta. Poprawiono czytelność etykiet wersjonowania na liście ofert (numer oferty offer_id/offer_id.N zamieniony miejscami z nazwą oferty jako główny nagłówek wiersza, wyraźniejsza etykieta „poprzednia wersja”). Przycisk „Aktualizuj pozycję” w kalkulatorze zmienia teraz kolor na niebieski podczas edycji istniejącej pozycji, aby odróżnić go od żółtego przycisku dodawania nowej pozycji. Kliknięcie pozycji na liście zestawienia (wiersz lub ołówek) przewija teraz widok automatycznie do góry kalkulatora. Cena bazowa PGL jest od teraz zawsze w EUR (€/t), niezależnie od waluty oferty.</w:t>
+              <w:t>Uzupełniono tabelę gatunków PICKLED (HRS Trawiona) o brakujący zakres SAPH 440 -&gt; DD12 wraz z dodatkowymi gatunkami (K367-DD14+B, FE 600 DP, S300EK, P265GH, P275SL, P355NL2, SA516G60-LOWSI, S240 D), na podstawie danych przekazanych przez klienta. Poprawiono czytelność etykiet wersjonowania na liście ofert (numer oferty offer_id/offer_id.N zamieniony miejscami z nazwą oferty jako główny nagłówek wiersza, wyraźniejsza etykieta „poprzednia wersja”). Przycisk „Aktualizuj pozycję” w kalkulatorze zmienia teraz kolor na niebieski podczas edycji istniejącej pozycji, aby odróżnić go od żółtego przycisku dodawania nowej pozycji. Kliknięcie pozycji na liście zestawienia (wiersz lub ołówek) przewija teraz widok automatycznie do góry kalkulatora. Cena bazowa PGL jest od teraz zawsze w EUR (€/t), niezależnie od waluty oferty. Podczas edycji zapisanej oferty w kalkulatorze pojawia się teraz wyraźny baner „Teraz edytujesz ofertę: offer_id”, tak by nie pomylić jej z tworzeniem nowej wyceny; baner pokazuje właściwy numer wersji (np. offer_27.1), nie surowe wewnętrzne ID wiersza w bazie.</w:t>
             </w:r>
           </w:p>
         </w:tc>
@@ -913,6 +913,28 @@
           </w:p>
         </w:tc>
       </w:tr>
+      <w:tr>
+        <w:tc>
+          <w:tcPr>
+            <w:tcW w:w="1948" w:type="dxa"/>
+          </w:tcPr>
+          <w:p>
+            <w:r>
+              <w:t>Zmiana</w:t>
+            </w:r>
+          </w:p>
+        </w:tc>
+        <w:tc>
+          <w:tcPr>
+            <w:tcW w:w="6908" w:type="dxa"/>
+          </w:tcPr>
+          <w:p>
+            <w:r>
+              <w:t>Podczas edycji zapisanej oferty w kalkulatorze pojawia się teraz wyraźny baner na górze strony: „Teraz edytujesz ofertę: offer_id” - zgłoszenie od użytkowników, którzy nie zauważali dyskretnej etykiety w nagłówku i myleli tryb edycji z tworzeniem nowej wyceny. Baner pokazuje numer wersji oferty w tym samym formacie co lista ofert (np. „offer_27.1”) - pierwotna wersja pokazywała surowe, wewnętrzne ID wiersza z bazy (np. „offer_30” dla oferty widocznej na liście jako „27.1”), co było mylące; poprawiono, licząc etykietę z root_offer_id i numeru wersji, tak samo jak wszędzie indziej w aplikacji.</w:t>
+            </w:r>
+          </w:p>
+        </w:tc>
+      </w:tr>
     </w:tbl>
     <w:p>
       <w:pPr>

</xml_diff>

<commit_message>
feat: generate offer PDFs in the seller's selected UI language
PDF export was hardcoded to Polish regardless of the app's language
setting. Now table headers, client-data labels, footer legal notes,
date locale and signature lines render in PL/EN/CS/DE based on the
seller's current UI language, threaded from Calculator/senior/offers/
admin pages through downloadServerPdf to /api/generate-pdf.

Also logs the change in the v1.6 version report.
</commit_message>
<xml_diff>
--- a/Historia wersji oraz md/Historia wersji/AMSteel_Quote_Raport_Wersji_1.6.docx
+++ b/Historia wersji oraz md/Historia wersji/AMSteel_Quote_Raport_Wersji_1.6.docx
@@ -282,7 +282,7 @@
           </w:tcPr>
           <w:p>
             <w:r>
-              <w:t>Uzupełniono tabelę gatunków PICKLED (HRS Trawiona) o brakujący zakres SAPH 440 -&gt; DD12 wraz z dodatkowymi gatunkami (K367-DD14+B, FE 600 DP, S300EK, P265GH, P275SL, P355NL2, SA516G60-LOWSI, S240 D), na podstawie danych przekazanych przez klienta. Poprawiono czytelność etykiet wersjonowania na liście ofert (numer oferty offer_id/offer_id.N zamieniony miejscami z nazwą oferty jako główny nagłówek wiersza, wyraźniejsza etykieta „poprzednia wersja”). Przycisk „Aktualizuj pozycję” w kalkulatorze zmienia teraz kolor na niebieski podczas edycji istniejącej pozycji, aby odróżnić go od żółtego przycisku dodawania nowej pozycji. Kliknięcie pozycji na liście zestawienia (wiersz lub ołówek) przewija teraz widok automatycznie do góry kalkulatora. Cena bazowa PGL jest od teraz zawsze w EUR (€/t), niezależnie od waluty oferty. Podczas edycji zapisanej oferty w kalkulatorze pojawia się teraz wyraźny baner „Teraz edytujesz ofertę: offer_id”, tak by nie pomylić jej z tworzeniem nowej wyceny; baner pokazuje właściwy numer wersji (np. offer_27.1), nie surowe wewnętrzne ID wiersza w bazie.</w:t>
+              <w:t>Uzupełniono tabelę gatunków PICKLED (HRS Trawiona) o brakujący zakres SAPH 440 -&gt; DD12 wraz z dodatkowymi gatunkami (K367-DD14+B, FE 600 DP, S300EK, P265GH, P275SL, P355NL2, SA516G60-LOWSI, S240 D), na podstawie danych przekazanych przez klienta. Poprawiono czytelność etykiet wersjonowania na liście ofert (numer oferty offer_id/offer_id.N zamieniony miejscami z nazwą oferty jako główny nagłówek wiersza, wyraźniejsza etykieta „poprzednia wersja”). Przycisk „Aktualizuj pozycję” w kalkulatorze zmienia teraz kolor na niebieski podczas edycji istniejącej pozycji, aby odróżnić go od żółtego przycisku dodawania nowej pozycji. Kliknięcie pozycji na liście zestawienia (wiersz lub ołówek) przewija teraz widok automatycznie do góry kalkulatora. Cena bazowa PGL jest od teraz zawsze w EUR (€/t), niezależnie od waluty oferty. Podczas edycji zapisanej oferty w kalkulatorze pojawia się teraz wyraźny baner „Teraz edytujesz ofertę: offer_id”, tak by nie pomylić jej z tworzeniem nowej wyceny; baner pokazuje właściwy numer wersji (np. offer_27.1), nie surowe wewnętrzne ID wiersza w bazie. Tryb wysokiego kontrastu doczekał się osobnych wariantów jasnego i ciemnego (wcześniej był to jeden, stały motyw ignorujący przełącznik jasny/ciemny) - przełączanie między jasnym a ciemnym motywem działa teraz poprawnie również przy włączonym wysokim kontraście, a wyłączenie wysokiego kontrastu przywraca wcześniej wybrany motyw jasny lub ciemny. Poprawiono też kilka miejsc w interfejsie (pasek „Suma Huta”, przyciski przełączające, podpowiedzi gatunków, komunikaty ostrzegawcze), w których kolory tła i tekstu były zapisane na sztywno pod jasny wysoki kontrast i stawały się nieczytelne w wariancie ciemnym. Panel administratora zyskał filtrowanie i sortowanie historii zmian cen bazowych PGL (po typie stali, zakresie dat i dowolnej kolumnie tabeli) wraz z przyciskiem czyszczącym filtry; eksport do Excela odzwierciedla teraz aktualnie wybrany widok, a nie zawsze całą historię. Generowanie oferty PDF respektuje teraz język interfejsu wybrany przez handlowca (PL/EN/CS/DE) - wcześniej cały szablon PDF (nagłówki tabeli, etykiety danych klienta, uwagi prawne w stopce, podpisy) był na sztywno po polsku, niezależnie od języka ustawionego w aplikacji.</w:t>
             </w:r>
           </w:p>
         </w:tc>
@@ -1011,7 +1011,7 @@
           </w:tcPr>
           <w:p>
             <w:r>
-              <w:t>—</w:t>
+              <w:t>Zmiana</w:t>
             </w:r>
           </w:p>
         </w:tc>
@@ -1021,7 +1021,7 @@
           </w:tcPr>
           <w:p>
             <w:r>
-              <w:t>Brak zmian</w:t>
+              <w:t>Generowanie oferty PDF respektuje teraz język interfejsu wybrany przez handlowca (PL/EN/CS/DE), zamiast być zawsze po polsku - tłumaczenie obejmuje nagłówki tabeli pozycji, etykiety danych klienta, uwagi prawne w stopce oraz podpisy.</w:t>
             </w:r>
           </w:p>
         </w:tc>
@@ -1113,6 +1113,50 @@
           <w:p>
             <w:r>
               <w:t>Przy edycji istniejącej pozycji w kalkulatorze przycisk „Aktualizuj pozycję” zmienia teraz kolor na niebieski, odróżniając się od żółtego przycisku „Dodaj do listy” używanego przy dodawaniu nowej pozycji - zapobiega przypadkowemu pomyleniu trybu edycji z dodawaniem nowej pozycji.</w:t>
+            </w:r>
+          </w:p>
+        </w:tc>
+      </w:tr>
+      <w:tr>
+        <w:tc>
+          <w:tcPr>
+            <w:tcW w:w="1963" w:type="dxa"/>
+          </w:tcPr>
+          <w:p>
+            <w:r>
+              <w:t>Zmiana</w:t>
+            </w:r>
+          </w:p>
+        </w:tc>
+        <w:tc>
+          <w:tcPr>
+            <w:tcW w:w="6893" w:type="dxa"/>
+          </w:tcPr>
+          <w:p>
+            <w:r>
+              <w:t>Tryb wysokiego kontrastu ma teraz osobny wariant jasny i ciemny - przycisk jasny/ciemny motyw działa również przy włączonym wysokim kontraście (wcześniej kliknięcie w niego nic nie zmieniało wizualnie, dopóki nie wyłączono wysokiego kontrastu). Poprawiono też czytelność kilku elementów (m.in. pasek „Suma Huta”, przyciski przełączające, podpowiedzi gatunków, komunikaty ostrzegawcze) w ciemnym wariancie wysokiego kontrastu, gdzie tekst i tło były wcześniej zapisane na sztywno pod jasny motyw.</w:t>
+            </w:r>
+          </w:p>
+        </w:tc>
+      </w:tr>
+      <w:tr>
+        <w:tc>
+          <w:tcPr>
+            <w:tcW w:w="1963" w:type="dxa"/>
+          </w:tcPr>
+          <w:p>
+            <w:r>
+              <w:t>Zmiana</w:t>
+            </w:r>
+          </w:p>
+        </w:tc>
+        <w:tc>
+          <w:tcPr>
+            <w:tcW w:w="6893" w:type="dxa"/>
+          </w:tcPr>
+          <w:p>
+            <w:r>
+              <w:t>W panelu administratora, w sekcji „Historia zmian PGL bazowego”, dodano filtrowanie i sortowanie: klikalne filtry po typie stali (HRS/CR/HDG/PICKLED/TEARDROP/ZM), zakres dat „Od” / „Do” oraz sortowanie po dowolnej kolumnie kliknięciem nagłówka (typ, stara/nowa cena, zmiana, kto zmienił, data) z możliwością odwrócenia kierunku. Dodano przycisk „Wyczyść filtry”, widoczny tylko gdy jakiś filtr jest aktywny. Eksport do Excela pobiera teraz dokładnie to, co widać na ekranie - z uwzględnieniem aktywnych filtrów i wybranego sortowania, a nie zawsze całą historię.</w:t>
             </w:r>
           </w:p>
         </w:tc>

</xml_diff>

<commit_message>
fix: stop offer card click from swallowing previous-version row clicks
Clicking the "poprzednie wersje" toggle or a specific version row in
the expanded history on the offers list bubbled up to the parent
card's own click handler, opening the newest version for edit instead
of the one actually clicked. Isolated the whole previous-versions
section from the card's click handler.

Logged the fix in the v1.6 version report.
</commit_message>
<xml_diff>
--- a/Historia wersji oraz md/Historia wersji/AMSteel_Quote_Raport_Wersji_1.6.docx
+++ b/Historia wersji oraz md/Historia wersji/AMSteel_Quote_Raport_Wersji_1.6.docx
@@ -282,7 +282,7 @@
           </w:tcPr>
           <w:p>
             <w:r>
-              <w:t>Uzupełniono tabelę gatunków PICKLED (HRS Trawiona) o brakujący zakres SAPH 440 -&gt; DD12 wraz z dodatkowymi gatunkami (K367-DD14+B, FE 600 DP, S300EK, P265GH, P275SL, P355NL2, SA516G60-LOWSI, S240 D), na podstawie danych przekazanych przez klienta. Poprawiono czytelność etykiet wersjonowania na liście ofert (numer oferty offer_id/offer_id.N zamieniony miejscami z nazwą oferty jako główny nagłówek wiersza, wyraźniejsza etykieta „poprzednia wersja”). Przycisk „Aktualizuj pozycję” w kalkulatorze zmienia teraz kolor na niebieski podczas edycji istniejącej pozycji, aby odróżnić go od żółtego przycisku dodawania nowej pozycji. Kliknięcie pozycji na liście zestawienia (wiersz lub ołówek) przewija teraz widok automatycznie do góry kalkulatora. Cena bazowa PGL jest od teraz zawsze w EUR (€/t), niezależnie od waluty oferty. Podczas edycji zapisanej oferty w kalkulatorze pojawia się teraz wyraźny baner „Teraz edytujesz ofertę: offer_id”, tak by nie pomylić jej z tworzeniem nowej wyceny; baner pokazuje właściwy numer wersji (np. offer_27.1), nie surowe wewnętrzne ID wiersza w bazie. Tryb wysokiego kontrastu doczekał się osobnych wariantów jasnego i ciemnego (wcześniej był to jeden, stały motyw ignorujący przełącznik jasny/ciemny) - przełączanie między jasnym a ciemnym motywem działa teraz poprawnie również przy włączonym wysokim kontraście, a wyłączenie wysokiego kontrastu przywraca wcześniej wybrany motyw jasny lub ciemny. Poprawiono też kilka miejsc w interfejsie (pasek „Suma Huta”, przyciski przełączające, podpowiedzi gatunków, komunikaty ostrzegawcze), w których kolory tła i tekstu były zapisane na sztywno pod jasny wysoki kontrast i stawały się nieczytelne w wariancie ciemnym. Panel administratora zyskał filtrowanie i sortowanie historii zmian cen bazowych PGL (po typie stali, zakresie dat i dowolnej kolumnie tabeli) wraz z przyciskiem czyszczącym filtry; eksport do Excela odzwierciedla teraz aktualnie wybrany widok, a nie zawsze całą historię. Generowanie oferty PDF respektuje teraz język interfejsu wybrany przez handlowca (PL/EN/CS/DE) - wcześniej cały szablon PDF (nagłówki tabeli, etykiety danych klienta, uwagi prawne w stopce, podpisy) był na sztywno po polsku, niezależnie od języka ustawionego w aplikacji.</w:t>
+              <w:t>Uzupełniono tabelę gatunków PICKLED (HRS Trawiona) o brakujący zakres SAPH 440 -&gt; DD12 wraz z dodatkowymi gatunkami (K367-DD14+B, FE 600 DP, S300EK, P265GH, P275SL, P355NL2, SA516G60-LOWSI, S240 D), na podstawie danych przekazanych przez klienta. Poprawiono czytelność etykiet wersjonowania na liście ofert (numer oferty offer_id/offer_id.N zamieniony miejscami z nazwą oferty jako główny nagłówek wiersza, wyraźniejsza etykieta „poprzednia wersja”). Przycisk „Aktualizuj pozycję” w kalkulatorze zmienia teraz kolor na niebieski podczas edycji istniejącej pozycji, aby odróżnić go od żółtego przycisku dodawania nowej pozycji. Kliknięcie pozycji na liście zestawienia (wiersz lub ołówek) przewija teraz widok automatycznie do góry kalkulatora. Cena bazowa PGL jest od teraz zawsze w EUR (€/t), niezależnie od waluty oferty. Podczas edycji zapisanej oferty w kalkulatorze pojawia się teraz wyraźny baner „Teraz edytujesz ofertę: offer_id”, tak by nie pomylić jej z tworzeniem nowej wyceny; baner pokazuje właściwy numer wersji (np. offer_27.1), nie surowe wewnętrzne ID wiersza w bazie. Tryb wysokiego kontrastu doczekał się osobnych wariantów jasnego i ciemnego (wcześniej był to jeden, stały motyw ignorujący przełącznik jasny/ciemny) - przełączanie między jasnym a ciemnym motywem działa teraz poprawnie również przy włączonym wysokim kontraście, a wyłączenie wysokiego kontrastu przywraca wcześniej wybrany motyw jasny lub ciemny. Poprawiono też kilka miejsc w interfejsie (pasek „Suma Huta”, przyciski przełączające, podpowiedzi gatunków, komunikaty ostrzegawcze), w których kolory tła i tekstu były zapisane na sztywno pod jasny wysoki kontrast i stawały się nieczytelne w wariancie ciemnym. Panel administratora zyskał filtrowanie i sortowanie historii zmian cen bazowych PGL (po typie stali, zakresie dat i dowolnej kolumnie tabeli) wraz z przyciskiem czyszczącym filtry; eksport do Excela odzwierciedla teraz aktualnie wybrany widok, a nie zawsze całą historię. Generowanie oferty PDF respektuje teraz język interfejsu wybrany przez handlowca (PL/EN/CS/DE) - wcześniej cały szablon PDF (nagłówki tabeli, etykiety danych klienta, uwagi prawne w stopce, podpisy) był na sztywno po polsku, niezależnie od języka ustawionego w aplikacji. Na liście „Moje oferty” naprawiono kliknięcie w rozwiniętej historii wersji ofert, które błędnie otwierało do edycji zawsze najnowszą wersję zamiast tej faktycznie klikniętej.</w:t>
             </w:r>
           </w:p>
         </w:tc>
@@ -935,6 +935,28 @@
           </w:p>
         </w:tc>
       </w:tr>
+      <w:tr>
+        <w:tc>
+          <w:tcPr>
+            <w:tcW w:w="1948" w:type="dxa"/>
+          </w:tcPr>
+          <w:p>
+            <w:r>
+              <w:t>Zmiana</w:t>
+            </w:r>
+          </w:p>
+        </w:tc>
+        <w:tc>
+          <w:tcPr>
+            <w:tcW w:w="6908" w:type="dxa"/>
+          </w:tcPr>
+          <w:p>
+            <w:r>
+              <w:t>Na liście „Moje oferty” naprawiono niezamierzone „przenikanie” kliknięcia (event bubbling): kliknięcie przycisku „poprzednie wersje” albo wiersza konkretnej wcześniejszej wersji (np. offer_27.1) w rozwiniętej historii wersji otwierało do edycji zawsze najnowszą wersję oferty (np. offer_27.5) zamiast wybranej - kliknięcie „bąbelkowało” w górę do klikalnej całej karty oferty na liście. Poprawiono, izolując całą sekcję poprzednich wersji (przycisk rozwijania i listę wierszy historii) od kliknięcia karty nadrzędnej: przycisk „poprzednie wersje” działa teraz jak zwykły przycisk rozwijający/zwijający, a kliknięcie w konkretny wiersz historii otwiera do edycji właśnie tę, wybraną wersję.</w:t>
+            </w:r>
+          </w:p>
+        </w:tc>
+      </w:tr>
     </w:tbl>
     <w:p>
       <w:pPr>

</xml_diff>

<commit_message>
docs: DeepAgent deployment prompt v8 (v1.6 -> v1.7) + version report
v8 covers the v1.7 batch: migrations 019 (team_members) and 020 (transport
tariff + route_cache), senior team-scoped analytics, route-based transport
pricing, Handlowcy performance metrics, unsaved-changes guard, high-contrast
palette, width-based Łezka surcharge. Also lands the never-shipped v7 draft
and the v1.6 report backup.

Co-Authored-By: Claude Sonnet 5 <noreply@anthropic.com>
Claude-Session: https://claude.ai/code/session_01GRLN9yPbsV2rGiXBgERPMp
</commit_message>
<xml_diff>
--- a/Historia wersji oraz md/Historia wersji/AMSteel_Quote_Raport_Wersji_1.6.docx
+++ b/Historia wersji oraz md/Historia wersji/AMSteel_Quote_Raport_Wersji_1.6.docx
@@ -115,7 +115,7 @@
           </w:tcPr>
           <w:p>
             <w:r>
-              <w:t>19.08.2026 - ..</w:t>
+              <w:t>19.08.2026 - 01.09.2026</w:t>
             </w:r>
           </w:p>
         </w:tc>
@@ -141,7 +141,7 @@
           </w:tcPr>
           <w:p>
             <w:r>
-              <w:t>19.08.2026</w:t>
+              <w:t>01.09.2026</w:t>
             </w:r>
           </w:p>
         </w:tc>
@@ -262,7 +262,7 @@
           </w:tcPr>
           <w:p>
             <w:r>
-              <w:t>19.08.2026 - ..</w:t>
+              <w:t>19.08.2026 - 01.09.2026</w:t>
             </w:r>
           </w:p>
         </w:tc>
@@ -272,7 +272,7 @@
           </w:tcPr>
           <w:p>
             <w:r>
-              <w:t>19.08.2026</w:t>
+              <w:t>01.09.2026</w:t>
             </w:r>
           </w:p>
         </w:tc>
@@ -282,7 +282,7 @@
           </w:tcPr>
           <w:p>
             <w:r>
-              <w:t>Uzupełniono tabelę gatunków PICKLED (HRS Trawiona) o brakujący zakres SAPH 440 -&gt; DD12 wraz z dodatkowymi gatunkami (K367-DD14+B, FE 600 DP, S300EK, P265GH, P275SL, P355NL2, SA516G60-LOWSI, S240 D), na podstawie danych przekazanych przez klienta. Poprawiono czytelność etykiet wersjonowania na liście ofert (numer oferty offer_id/offer_id.N zamieniony miejscami z nazwą oferty jako główny nagłówek wiersza, wyraźniejsza etykieta „poprzednia wersja”). Przycisk „Aktualizuj pozycję” w kalkulatorze zmienia teraz kolor na niebieski podczas edycji istniejącej pozycji, aby odróżnić go od żółtego przycisku dodawania nowej pozycji. Kliknięcie pozycji na liście zestawienia (wiersz lub ołówek) przewija teraz widok automatycznie do góry kalkulatora. Cena bazowa PGL jest od teraz zawsze w EUR (€/t), niezależnie od waluty oferty. Podczas edycji zapisanej oferty w kalkulatorze pojawia się teraz wyraźny baner „Teraz edytujesz ofertę: offer_id”, tak by nie pomylić jej z tworzeniem nowej wyceny; baner pokazuje właściwy numer wersji (np. offer_27.1), nie surowe wewnętrzne ID wiersza w bazie. Tryb wysokiego kontrastu doczekał się osobnych wariantów jasnego i ciemnego (wcześniej był to jeden, stały motyw ignorujący przełącznik jasny/ciemny) - przełączanie między jasnym a ciemnym motywem działa teraz poprawnie również przy włączonym wysokim kontraście, a wyłączenie wysokiego kontrastu przywraca wcześniej wybrany motyw jasny lub ciemny. Poprawiono też kilka miejsc w interfejsie (pasek „Suma Huta”, przyciski przełączające, podpowiedzi gatunków, komunikaty ostrzegawcze), w których kolory tła i tekstu były zapisane na sztywno pod jasny wysoki kontrast i stawały się nieczytelne w wariancie ciemnym. Panel administratora zyskał filtrowanie i sortowanie historii zmian cen bazowych PGL (po typie stali, zakresie dat i dowolnej kolumnie tabeli) wraz z przyciskiem czyszczącym filtry; eksport do Excela odzwierciedla teraz aktualnie wybrany widok, a nie zawsze całą historię. Generowanie oferty PDF respektuje teraz język interfejsu wybrany przez handlowca (PL/EN/CS/DE) - wcześniej cały szablon PDF (nagłówki tabeli, etykiety danych klienta, uwagi prawne w stopce, podpisy) był na sztywno po polsku, niezależnie od języka ustawionego w aplikacji. Na liście „Moje oferty” naprawiono kliknięcie w rozwiniętej historii wersji ofert, które błędnie otwierało do edycji zawsze najnowszą wersję zamiast tej faktycznie klikniętej.</w:t>
+              <w:t>Uzupełniono tabelę gatunków PICKLED (HRS Trawiona) o brakujący zakres SAPH 440 -&gt; DD12 wraz z dodatkowymi gatunkami (K367-DD14+B, FE 600 DP, S300EK, P265GH, P275SL, P355NL2, SA516G60-LOWSI, S240 D), na podstawie danych przekazanych przez klienta. Poprawiono czytelność etykiet wersjonowania na liście ofert (numer oferty offer_id/offer_id.N zamieniony miejscami z nazwą oferty jako główny nagłówek wiersza, wyraźniejsza etykieta „poprzednia wersja”). Przycisk „Aktualizuj pozycję” w kalkulatorze zmienia teraz kolor na niebieski podczas edycji istniejącej pozycji, aby odróżnić go od żółtego przycisku dodawania nowej pozycji. Kliknięcie pozycji na liście zestawienia (wiersz lub ołówek) przewija teraz widok automatycznie do góry kalkulatora. Cena bazowa PGL jest od teraz zawsze w EUR (€/t), niezależnie od waluty oferty. Podczas edycji zapisanej oferty w kalkulatorze pojawia się teraz wyraźny baner „Teraz edytujesz ofertę: offer_id”, tak by nie pomylić jej z tworzeniem nowej wyceny; baner pokazuje właściwy numer wersji (np. offer_27.1), nie surowe wewnętrzne ID wiersza w bazie. Tryb wysokiego kontrastu doczekał się osobnych wariantów jasnego i ciemnego (wcześniej był to jeden, stały motyw ignorujący przełącznik jasny/ciemny) - przełączanie między jasnym a ciemnym motywem działa teraz poprawnie również przy włączonym wysokim kontraście, a wyłączenie wysokiego kontrastu przywraca wcześniej wybrany motyw jasny lub ciemny. Poprawiono też kilka miejsc w interfejsie (pasek „Suma Huta”, przyciski przełączające, podpowiedzi gatunków, komunikaty ostrzegawcze), w których kolory tła i tekstu były zapisane na sztywno pod jasny wysoki kontrast i stawały się nieczytelne w wariancie ciemnym. Panel administratora zyskał filtrowanie i sortowanie historii zmian cen bazowych PGL (po typie stali, zakresie dat i dowolnej kolumnie tabeli) wraz z przyciskiem czyszczącym filtry; eksport do Excela odzwierciedla teraz aktualnie wybrany widok, a nie zawsze całą historię. Generowanie oferty PDF respektuje teraz język interfejsu wybrany przez handlowca (PL/EN/CS/DE) - wcześniej cały szablon PDF (nagłówki tabeli, etykiety danych klienta, uwagi prawne w stopce, podpisy) był na sztywno po polsku, niezależnie od języka ustawionego w aplikacji. Na liście „Moje oferty” naprawiono kliknięcie w rozwiniętej historii wersji ofert, które błędnie otwierało do edycji zawsze najnowszą wersję zamiast tej faktycznie klikniętej. W tej samej wersji dodano panel „Analiza” dla wszystkich ról (tonaż zaoferowany, wygrany i przegrany, wskaźnik skuteczności, rozbicie w czasie oraz według typu stali i klienta, tabela ofert z eksportem; zakres danych ustalany po stronie serwera - junior i senior widzą własne oferty, administrator całą firmę) wraz z nową osią „decyzja klienta” na ofercie wysłanej („wygrana” / „przegrana” / „oczekująca”, migracja 018), niezależną od statusu obiegu oferty.</w:t>
             </w:r>
           </w:p>
         </w:tc>
@@ -687,6 +687,28 @@
           </w:p>
         </w:tc>
       </w:tr>
+      <w:tr>
+        <w:tc>
+          <w:tcPr>
+            <w:tcW w:w="1948" w:type="dxa"/>
+          </w:tcPr>
+          <w:p>
+            <w:r>
+              <w:t>Zmiana</w:t>
+            </w:r>
+          </w:p>
+        </w:tc>
+        <w:tc>
+          <w:tcPr>
+            <w:tcW w:w="6908" w:type="dxa"/>
+          </w:tcPr>
+          <w:p>
+            <w:r>
+              <w:t>Dodano migrację bazy danych 018 wprowadzającą osobną oś „decyzja klienta” na ofercie (client_decision: oczekująca / wygrana / przegrana, data decyzji, kto zapisał, notatka). Jest to wymiar niezależny od statusu obiegu oferty (szkic -&gt; do weryfikacji -&gt; zatwierdzona / odrzucona -&gt; wysłana): „zatwierdzona” oznacza akceptację seniora, a nie zakup przez klienta. Dane historyczne otrzymują wartość „oczekująca”, bez zgadywania wyników sprzed wprowadzenia tej kolumny. Lista ofert pobiera teraz te kolumny, więc migracja jest wymagana przed wdrożeniem tej wersji (migracje 001-017 są już na produkcji od wdrożenia wersji 1.5).</w:t>
+            </w:r>
+          </w:p>
+        </w:tc>
+      </w:tr>
     </w:tbl>
     <w:p>
       <w:pPr>
@@ -957,6 +979,28 @@
           </w:p>
         </w:tc>
       </w:tr>
+      <w:tr>
+        <w:tc>
+          <w:tcPr>
+            <w:tcW w:w="1948" w:type="dxa"/>
+          </w:tcPr>
+          <w:p>
+            <w:r>
+              <w:t>Zmiana</w:t>
+            </w:r>
+          </w:p>
+        </w:tc>
+        <w:tc>
+          <w:tcPr>
+            <w:tcW w:w="6908" w:type="dxa"/>
+          </w:tcPr>
+          <w:p>
+            <w:r>
+              <w:t>Handlowiec może teraz odnotować odpowiedź klienta na wysłaną ofertę: „wygrana” lub „przegrana” (z opcjonalną notatką - np. cena, termin, konkurencja), a pomyłkę cofnąć z powrotem do „oczekująca”. Decyzję można zapisać wyłącznie na ofercie o statusie „wysłana”. Właściciel zapisuje ją na swojej ofercie, senior i administrator na dowolnej - tak samo jak przy weryfikacji i wysyłce cudzych ofert. Wynik zasila nowy panel Analiza (tonaż wygrany / przegrany, wskaźnik skuteczności).</w:t>
+            </w:r>
+          </w:p>
+        </w:tc>
+      </w:tr>
     </w:tbl>
     <w:p>
       <w:pPr>
@@ -1183,6 +1227,28 @@
           </w:p>
         </w:tc>
       </w:tr>
+      <w:tr>
+        <w:tc>
+          <w:tcPr>
+            <w:tcW w:w="1963" w:type="dxa"/>
+          </w:tcPr>
+          <w:p>
+            <w:r>
+              <w:t>Zmiana</w:t>
+            </w:r>
+          </w:p>
+        </w:tc>
+        <w:tc>
+          <w:tcPr>
+            <w:tcW w:w="6893" w:type="dxa"/>
+          </w:tcPr>
+          <w:p>
+            <w:r>
+              <w:t>Dodano panel „Analiza” - nową zakładkę w nawigacji, dostępną dla każdej roli. Junior i senior widzą wyłącznie własne oferty, administrator całą firmę; zakres danych ustala serwer, nie adres strony. Panel pokazuje tonaż zaoferowany, wygrany i przegrany, wskaźnik skuteczności, rozbicie w czasie oraz według typu stali i klienta, a także tabelę ofert z eksportem. Ofertę z wieloma wersjami (offer_30, offer_30.1, ...) liczy się raz - jako najnowszą wersję rodziny. Przy okazji wspólne kolory wykresów oraz zmienne motywu (jasny / ciemny / wysoki kontrast) wydzielono do jednego miejsca zamiast powielać je w kodzie każdej podstrony.</w:t>
+            </w:r>
+          </w:p>
+        </w:tc>
+      </w:tr>
     </w:tbl>
     <w:p>
       <w:pPr>
@@ -1235,7 +1301,7 @@
         <w:pStyle w:val="Listapunktowana"/>
       </w:pPr>
       <w:r>
-        <w:t>Migracje wersjonowania ofert (015) oraz minimalnej marży (014) nie zostały jeszcze uruchomione na środowisku produkcyjnym - na razie działają tylko lokalnie.</w:t>
+        <w:t>Migracja „decyzja klienta” (018) nie została jeszcze uruchomiona na środowisku produkcyjnym - wymagana przed wdrożeniem panelu Analiza. Migracje 001-017 są już na produkcji od wdrożenia wersji 1.5 (17.08.2026).</w:t>
       </w:r>
     </w:p>
     <w:p>

</xml_diff>